<commit_message>
Update corporate titles: Hadi Irvani is now Board Member and Hunter Morris is now Co-Founder & Managing Director
</commit_message>
<xml_diff>
--- a/01_Strategic_&_Business_Plans/00_START_HERE_Hunter_Action_Guide.docx
+++ b/01_Strategic_&_Business_Plans/00_START_HERE_Hunter_Action_Guide.docx
@@ -35,7 +35,7 @@
         <w:rPr>
           <w:b/>
         </w:rPr>
-        <w:t>Founder &amp; Managing Director</w:t>
+        <w:t>Co-Founder &amp; Managing Director</w:t>
       </w:r>
       <w:r>
         <w:t>: Hunter (Fly Fishing Georgia North Mountains)</w:t>
@@ -47,7 +47,7 @@
         <w:rPr>
           <w:b/>
         </w:rPr>
-        <w:t>Co-Founder &amp; Board Member</w:t>
+        <w:t>Board Member</w:t>
       </w:r>
       <w:r>
         <w:t>: Hadi Irvani (General Partner at Infill Capital, University of Virginia - UVA)</w:t>

</xml_diff>